<commit_message>
chore: change privacy policy
</commit_message>
<xml_diff>
--- a/public/privacy-policy.docx
+++ b/public/privacy-policy.docx
@@ -155,26 +155,6 @@
           <w:rFonts w:ascii="Bookman Old Style" w:hAnsi="Bookman Old Style"/>
           <w:color w:val="000000" w:themeColor="text1"/>
         </w:rPr>
-        <w:t>Browser type, device type, and operating system</w:t>
-      </w:r>
-    </w:p>
-    <w:p>
-      <w:pPr>
-        <w:pStyle w:val="ListParagraph"/>
-        <w:numPr>
-          <w:ilvl w:val="0"/>
-          <w:numId w:val="19"/>
-        </w:numPr>
-        <w:rPr>
-          <w:rFonts w:ascii="Bookman Old Style" w:hAnsi="Bookman Old Style"/>
-          <w:color w:val="000000" w:themeColor="text1"/>
-        </w:rPr>
-      </w:pPr>
-      <w:r>
-        <w:rPr>
-          <w:rFonts w:ascii="Bookman Old Style" w:hAnsi="Bookman Old Style"/>
-          <w:color w:val="000000" w:themeColor="text1"/>
-        </w:rPr>
         <w:t>Date, time, and duration of your visit</w:t>
       </w:r>
     </w:p>
@@ -967,75 +947,6 @@
           <w:color w:val="000000" w:themeColor="text1"/>
         </w:rPr>
       </w:pPr>
-    </w:p>
-    <w:p>
-      <w:pPr>
-        <w:pStyle w:val="Heading2"/>
-        <w:rPr>
-          <w:rFonts w:ascii="Bookman Old Style" w:hAnsi="Bookman Old Style"/>
-          <w:color w:val="000000" w:themeColor="text1"/>
-        </w:rPr>
-      </w:pPr>
-      <w:r>
-        <w:rPr>
-          <w:rFonts w:ascii="Bookman Old Style" w:hAnsi="Bookman Old Style"/>
-          <w:color w:val="000000" w:themeColor="text1"/>
-        </w:rPr>
-        <w:t>7.</w:t>
-      </w:r>
-      <w:r>
-        <w:rPr>
-          <w:rFonts w:ascii="Bookman Old Style" w:hAnsi="Bookman Old Style"/>
-          <w:color w:val="000000" w:themeColor="text1"/>
-        </w:rPr>
-        <w:t xml:space="preserve"> CONTACT US</w:t>
-      </w:r>
-    </w:p>
-    <w:p>
-      <w:pPr>
-        <w:rPr>
-          <w:rFonts w:ascii="Bookman Old Style" w:hAnsi="Bookman Old Style"/>
-          <w:color w:val="000000" w:themeColor="text1"/>
-        </w:rPr>
-      </w:pPr>
-      <w:r>
-        <w:rPr>
-          <w:rFonts w:ascii="Bookman Old Style" w:hAnsi="Bookman Old Style"/>
-          <w:color w:val="000000" w:themeColor="text1"/>
-        </w:rPr>
-        <w:t>For any questions regarding this Privacy Policy or to request information about your personal data, please contact us at:</w:t>
-      </w:r>
-      <w:r>
-        <w:rPr>
-          <w:rFonts w:ascii="Bookman Old Style" w:hAnsi="Bookman Old Style"/>
-          <w:color w:val="000000" w:themeColor="text1"/>
-        </w:rPr>
-        <w:br/>
-      </w:r>
-      <w:r>
-        <w:rPr>
-          <w:rFonts w:ascii="Bookman Old Style" w:hAnsi="Bookman Old Style"/>
-          <w:color w:val="000000" w:themeColor="text1"/>
-        </w:rPr>
-        <w:br/>
-        <w:t xml:space="preserve">Email: </w:t>
-      </w:r>
-      <w:r>
-        <w:rPr>
-          <w:rFonts w:ascii="Bookman Old Style" w:hAnsi="Bookman Old Style"/>
-          <w:color w:val="000000" w:themeColor="text1"/>
-        </w:rPr>
-        <w:br/>
-        <w:t xml:space="preserve">Phone: </w:t>
-      </w:r>
-      <w:r>
-        <w:rPr>
-          <w:rFonts w:ascii="Bookman Old Style" w:hAnsi="Bookman Old Style"/>
-          <w:color w:val="000000" w:themeColor="text1"/>
-        </w:rPr>
-        <w:br/>
-        <w:t>Office Address:</w:t>
-      </w:r>
     </w:p>
     <w:p>
       <w:pPr>

</xml_diff>